<commit_message>
Giu nguyen cong 8085 cua restaurant-service theo dung de bai
Co-Authored-By: Claude Opus 5 <noreply@anthropic.com>
</commit_message>
<xml_diff>
--- a/docs/Bao-cao-Bai2.docx
+++ b/docs/Bao-cao-Bai2.docx
@@ -786,7 +786,7 @@
                 <w:rFonts w:ascii="Times New Roman" w:hAnsi="Times New Roman"/>
                 <w:sz w:val="18"/>
               </w:rPr>
-              <w:t>Cổng 8085 nằm ngoài dải quy ước của FoodX</w:t>
+              <w:t>Không tách cấu hình theo profile</w:t>
             </w:r>
           </w:p>
         </w:tc>
@@ -801,7 +801,7 @@
                 <w:rFonts w:ascii="Times New Roman" w:hAnsi="Times New Roman"/>
                 <w:sz w:val="18"/>
               </w:rPr>
-              <w:t>Khó quản lý, dễ đụng cổng khi triển khai</w:t>
+              <w:t>Không phân biệt được dev và prod</w:t>
             </w:r>
           </w:p>
         </w:tc>
@@ -816,7 +816,7 @@
                 <w:rFonts w:ascii="Times New Roman" w:hAnsi="Times New Roman"/>
                 <w:sz w:val="18"/>
               </w:rPr>
-              <w:t>Chuẩn hóa về 8081</w:t>
+              <w:t>Tách thành {app}.yml, {app}-dev.yml, {app}-prod.yml</w:t>
             </w:r>
           </w:p>
         </w:tc>
@@ -850,7 +850,7 @@
                 <w:rFonts w:ascii="Times New Roman" w:hAnsi="Times New Roman"/>
                 <w:sz w:val="18"/>
               </w:rPr>
-              <w:t>Không tách cấu hình theo profile</w:t>
+              <w:t>Không có lớp cấu hình dùng chung</w:t>
             </w:r>
           </w:p>
         </w:tc>
@@ -866,7 +866,7 @@
                 <w:rFonts w:ascii="Times New Roman" w:hAnsi="Times New Roman"/>
                 <w:sz w:val="18"/>
               </w:rPr>
-              <w:t>Không phân biệt được dev và prod</w:t>
+              <w:t>Cấu hình giống nhau bị lặp ở mọi service</w:t>
             </w:r>
           </w:p>
         </w:tc>
@@ -874,68 +874,6 @@
           <w:tcPr>
             <w:tcW w:type="dxa" w:w="2422"/>
             <w:shd w:val="clear" w:color="auto" w:fill="EEF2F7"/>
-          </w:tcPr>
-          <w:p>
-            <w:r/>
-            <w:r>
-              <w:rPr>
-                <w:rFonts w:ascii="Times New Roman" w:hAnsi="Times New Roman"/>
-                <w:sz w:val="18"/>
-              </w:rPr>
-              <w:t>Tách thành {app}.yml, {app}-dev.yml, {app}-prod.yml</w:t>
-            </w:r>
-          </w:p>
-        </w:tc>
-      </w:tr>
-      <w:tr>
-        <w:tc>
-          <w:tcPr>
-            <w:tcW w:type="dxa" w:w="2422"/>
-          </w:tcPr>
-          <w:p>
-            <w:r/>
-            <w:r>
-              <w:rPr>
-                <w:rFonts w:ascii="Times New Roman" w:hAnsi="Times New Roman"/>
-                <w:sz w:val="18"/>
-              </w:rPr>
-              <w:t>5</w:t>
-            </w:r>
-          </w:p>
-        </w:tc>
-        <w:tc>
-          <w:tcPr>
-            <w:tcW w:type="dxa" w:w="2422"/>
-          </w:tcPr>
-          <w:p>
-            <w:r/>
-            <w:r>
-              <w:rPr>
-                <w:rFonts w:ascii="Times New Roman" w:hAnsi="Times New Roman"/>
-                <w:sz w:val="18"/>
-              </w:rPr>
-              <w:t>Không có lớp cấu hình dùng chung</w:t>
-            </w:r>
-          </w:p>
-        </w:tc>
-        <w:tc>
-          <w:tcPr>
-            <w:tcW w:type="dxa" w:w="2422"/>
-          </w:tcPr>
-          <w:p>
-            <w:r/>
-            <w:r>
-              <w:rPr>
-                <w:rFonts w:ascii="Times New Roman" w:hAnsi="Times New Roman"/>
-                <w:sz w:val="18"/>
-              </w:rPr>
-              <w:t>Cấu hình giống nhau bị lặp ở mọi service</w:t>
-            </w:r>
-          </w:p>
-        </w:tc>
-        <w:tc>
-          <w:tcPr>
-            <w:tcW w:type="dxa" w:w="2422"/>
           </w:tcPr>
           <w:p>
             <w:r/>
@@ -2524,7 +2462,7 @@
                 <w:rFonts w:ascii="Times New Roman" w:hAnsi="Times New Roman"/>
                 <w:sz w:val="18"/>
               </w:rPr>
-              <w:t>8085 (ngoài dải quy ước)</w:t>
+              <w:t>8085 (giữ nguyên)</w:t>
             </w:r>
           </w:p>
         </w:tc>
@@ -2539,7 +2477,7 @@
                 <w:rFonts w:ascii="Times New Roman" w:hAnsi="Times New Roman"/>
                 <w:sz w:val="18"/>
               </w:rPr>
-              <w:t>8081 (đúng dải FoodX)</w:t>
+              <w:t>8085 (đề bài không yêu cầu đổi cổng)</w:t>
             </w:r>
           </w:p>
         </w:tc>
@@ -5287,7 +5225,7 @@
                 <w:rFonts w:ascii="Consolas" w:hAnsi="Consolas" w:eastAsia="Consolas"/>
                 <w:sz w:val="16"/>
               </w:rPr>
-              <w:t>|-- restaurant-service.yml          &lt;- LỚP 3: riêng nhà hàng, cổng 8081</w:t>
+              <w:t>|-- restaurant-service.yml          &lt;- LỚP 3: riêng nhà hàng, cổng 8085</w:t>
             </w:r>
           </w:p>
           <w:p>
@@ -5576,7 +5514,7 @@
                 <w:rFonts w:ascii="Times New Roman" w:hAnsi="Times New Roman"/>
                 <w:sz w:val="18"/>
               </w:rPr>
-              <w:t>8081</w:t>
+              <w:t>8085</w:t>
             </w:r>
           </w:p>
         </w:tc>
@@ -8414,7 +8352,7 @@
           <w:i w:val="0"/>
           <w:sz w:val="24"/>
         </w:rPr>
-        <w:t>Đây chính là file sửa lỗi của thực tập sinh: đổi tên từ config.yml thành restaurant-service.yml, mã hóa mật khẩu bằng {cipher}, chuẩn hóa cổng về 8081 và bổ sung timeout, cờ tính năng cùng tham số nghiệp vụ nhà hàng.</w:t>
+        <w:t>Đây chính là file sửa lỗi của thực tập sinh: đổi tên từ config.yml thành restaurant-service.yml, mã hóa mật khẩu bằng {cipher}, giữ nguyên cổng 8085 và bổ sung timeout, cờ tính năng cùng tham số nghiệp vụ nhà hàng.</w:t>
       </w:r>
     </w:p>
     <w:tbl>
@@ -14658,7 +14596,7 @@
                 <w:rFonts w:ascii="Consolas" w:hAnsi="Consolas" w:eastAsia="Consolas"/>
                 <w:sz w:val="16"/>
               </w:rPr>
-              <w:t xml:space="preserve">    { "name": "...restaurant-service-dev.yml", "source": { "server.port": 8081 } },</w:t>
+              <w:t xml:space="preserve">    { "name": "...restaurant-service-dev.yml", "source": { "server.port": 8085 } },</w:t>
             </w:r>
           </w:p>
           <w:p>
@@ -14891,7 +14829,7 @@
                 <w:rFonts w:ascii="Consolas" w:hAnsi="Consolas" w:eastAsia="Consolas"/>
                 <w:sz w:val="16"/>
               </w:rPr>
-              <w:t>curl http://localhost:8081/actuator/env | jq '.propertySources[].name'</w:t>
+              <w:t>curl http://localhost:8085/actuator/env | jq '.propertySources[].name'</w:t>
             </w:r>
           </w:p>
           <w:p>
@@ -14927,7 +14865,7 @@
                 <w:rFonts w:ascii="Consolas" w:hAnsi="Consolas" w:eastAsia="Consolas"/>
                 <w:sz w:val="16"/>
               </w:rPr>
-              <w:t>curl http://localhost:8081/actuator/env/server.port</w:t>
+              <w:t>curl http://localhost:8085/actuator/env/server.port</w:t>
             </w:r>
           </w:p>
           <w:p>
@@ -14939,7 +14877,7 @@
                 <w:rFonts w:ascii="Consolas" w:hAnsi="Consolas" w:eastAsia="Consolas"/>
                 <w:sz w:val="16"/>
               </w:rPr>
-              <w:t>curl http://localhost:8081/actuator/env/spring.datasource.url</w:t>
+              <w:t>curl http://localhost:8085/actuator/env/spring.datasource.url</w:t>
             </w:r>
           </w:p>
         </w:tc>
@@ -15170,7 +15108,7 @@
                 <w:rFonts w:ascii="Consolas" w:hAnsi="Consolas" w:eastAsia="Consolas"/>
                 <w:sz w:val="16"/>
               </w:rPr>
-              <w:t>curl -X POST http://localhost:8081/actuator/refresh</w:t>
+              <w:t>curl -X POST http://localhost:8085/actuator/refresh</w:t>
             </w:r>
           </w:p>
           <w:p>
@@ -15230,7 +15168,7 @@
                 <w:rFonts w:ascii="Consolas" w:hAnsi="Consolas" w:eastAsia="Consolas"/>
                 <w:sz w:val="16"/>
               </w:rPr>
-              <w:t>curl -X POST http://localhost:8081/actuator/busrefresh</w:t>
+              <w:t>curl -X POST http://localhost:8085/actuator/busrefresh</w:t>
             </w:r>
           </w:p>
           <w:p>
@@ -15266,7 +15204,7 @@
                 <w:rFonts w:ascii="Consolas" w:hAnsi="Consolas" w:eastAsia="Consolas"/>
                 <w:sz w:val="16"/>
               </w:rPr>
-              <w:t>curl -X POST http://localhost:8081/actuator/busrefresh/restaurant-service:8081</w:t>
+              <w:t>curl -X POST http://localhost:8085/actuator/busrefresh/restaurant-service:8085</w:t>
             </w:r>
           </w:p>
         </w:tc>

</xml_diff>